<commit_message>
fix: update teacher dashboard class filter search and anti-cache cloud fetch
</commit_message>
<xml_diff>
--- a/HƯỚNG DẪN QUY TRÌNH CHO LỚP HỌC ĐỂ ĐẢM BẢO 100.docx
+++ b/HƯỚNG DẪN QUY TRÌNH CHO LỚP HỌC ĐỂ ĐẢM BẢO 100.docx
@@ -296,9 +296,103 @@
       </w:r>
     </w:p>
     <w:p>
+      <w:pPr>
+        <w:pStyle w:val="Heading3"/>
+      </w:pPr>
+      <w:r>
+        <w:t>QUY TRÌNH "3 KHÔNG" CHO SINH VIÊN TRÊN LỚP NÊN ÁP DỤNG</w:t>
+      </w:r>
+    </w:p>
+    <w:p>
+      <w:pPr>
+        <w:pStyle w:val="NormalWeb"/>
+        <w:numPr>
+          <w:ilvl w:val="0"/>
+          <w:numId w:val="2"/>
+        </w:numPr>
+      </w:pPr>
+      <w:r>
+        <w:rPr>
+          <w:b/>
+          <w:bCs/>
+        </w:rPr>
+        <w:t>Không mở ứng dụng từ Zalo/Facebook:</w:t>
+      </w:r>
+      <w:r>
+        <w:t xml:space="preserve"> Dặn sinh viên sao chép link trang web và dán trực tiếp vào </w:t>
+      </w:r>
+      <w:r>
+        <w:rPr>
+          <w:b/>
+          <w:bCs/>
+        </w:rPr>
+        <w:t>Safari</w:t>
+      </w:r>
+      <w:r>
+        <w:t xml:space="preserve"> (iPhone) hoặc </w:t>
+      </w:r>
+      <w:r>
+        <w:rPr>
+          <w:b/>
+          <w:bCs/>
+        </w:rPr>
+        <w:t>Chrome</w:t>
+      </w:r>
+      <w:r>
+        <w:t xml:space="preserve"> (Android).</w:t>
+      </w:r>
+    </w:p>
+    <w:p>
+      <w:pPr>
+        <w:pStyle w:val="NormalWeb"/>
+        <w:numPr>
+          <w:ilvl w:val="0"/>
+          <w:numId w:val="2"/>
+        </w:numPr>
+      </w:pPr>
+      <w:r>
+        <w:rPr>
+          <w:b/>
+          <w:bCs/>
+        </w:rPr>
+        <w:t>Không nộp bài đồng loạt cùng một giây:</w:t>
+      </w:r>
+      <w:r>
+        <w:t xml:space="preserve"> Khi hết giờ thực hành, bạn cho dãy 1 nộp trước, 5 giây sau đến dãy 2... để tránh nghẽn băng thông Upload Wi-Fi của trường.</w:t>
+      </w:r>
+    </w:p>
+    <w:p>
+      <w:pPr>
+        <w:pStyle w:val="NormalWeb"/>
+        <w:numPr>
+          <w:ilvl w:val="0"/>
+          <w:numId w:val="2"/>
+        </w:numPr>
+      </w:pPr>
+      <w:r>
+        <w:rPr>
+          <w:b/>
+          <w:bCs/>
+        </w:rPr>
+        <w:t>Không bỏ trống Tên/Biệt danh:</w:t>
+      </w:r>
+      <w:r>
+        <w:t xml:space="preserve"> Nhắc các em luôn gõ Tên và Tên Lớp chính xác trước khi bấm thu âm. </w:t>
+      </w:r>
+    </w:p>
+    <w:p>
+      <w:pPr>
+        <w:spacing w:before="100" w:beforeAutospacing="1" w:after="100" w:afterAutospacing="1" w:line="240" w:lineRule="auto"/>
+        <w:rPr>
+          <w:rFonts w:eastAsia="Times New Roman" w:cs="Times New Roman"/>
+          <w:sz w:val="24"/>
+          <w:szCs w:val="24"/>
+        </w:rPr>
+      </w:pPr>
       <w:bookmarkStart w:id="0" w:name="_GoBack"/>
       <w:bookmarkEnd w:id="0"/>
     </w:p>
+    <w:p/>
     <w:sectPr>
       <w:pgSz w:w="12240" w:h="15840"/>
       <w:pgMar w:top="1440" w:right="1440" w:bottom="1440" w:left="1440" w:header="720" w:footer="720" w:gutter="0"/>
@@ -312,6 +406,119 @@
 <file path=word/numbering.xml><?xml version="1.0" encoding="utf-8"?>
 <w:numbering xmlns:wpc="http://schemas.microsoft.com/office/word/2010/wordprocessingCanvas" xmlns:cx="http://schemas.microsoft.com/office/drawing/2014/chartex" xmlns:cx1="http://schemas.microsoft.com/office/drawing/2015/9/8/chartex" xmlns:mc="http://schemas.openxmlformats.org/markup-compatibility/2006" xmlns:o="urn:schemas-microsoft-com:office:office" xmlns:r="http://schemas.openxmlformats.org/officeDocument/2006/relationships" xmlns:m="http://schemas.openxmlformats.org/officeDocument/2006/math" xmlns:v="urn:schemas-microsoft-com:vml" xmlns:wp14="http://schemas.microsoft.com/office/word/2010/wordprocessingDrawing" xmlns:wp="http://schemas.openxmlformats.org/drawingml/2006/wordprocessingDrawing" xmlns:w10="urn:schemas-microsoft-com:office:word" xmlns:w="http://schemas.openxmlformats.org/wordprocessingml/2006/main" xmlns:w14="http://schemas.microsoft.com/office/word/2010/wordml" xmlns:w15="http://schemas.microsoft.com/office/word/2012/wordml" xmlns:w16se="http://schemas.microsoft.com/office/word/2015/wordml/symex" xmlns:wpg="http://schemas.microsoft.com/office/word/2010/wordprocessingGroup" xmlns:wpi="http://schemas.microsoft.com/office/word/2010/wordprocessingInk" xmlns:wne="http://schemas.microsoft.com/office/word/2006/wordml" xmlns:wps="http://schemas.microsoft.com/office/word/2010/wordprocessingShape" mc:Ignorable="w14 w15 w16se wp14">
   <w:abstractNum w:abstractNumId="0" w15:restartNumberingAfterBreak="0">
+    <w:nsid w:val="486B0654"/>
+    <w:multiLevelType w:val="multilevel"/>
+    <w:tmpl w:val="FDE0065A"/>
+    <w:lvl w:ilvl="0">
+      <w:start w:val="1"/>
+      <w:numFmt w:val="decimal"/>
+      <w:lvlText w:val="%1."/>
+      <w:lvlJc w:val="left"/>
+      <w:pPr>
+        <w:tabs>
+          <w:tab w:val="num" w:pos="720"/>
+        </w:tabs>
+        <w:ind w:left="720" w:hanging="360"/>
+      </w:pPr>
+    </w:lvl>
+    <w:lvl w:ilvl="1" w:tentative="1">
+      <w:start w:val="1"/>
+      <w:numFmt w:val="decimal"/>
+      <w:lvlText w:val="%2."/>
+      <w:lvlJc w:val="left"/>
+      <w:pPr>
+        <w:tabs>
+          <w:tab w:val="num" w:pos="1440"/>
+        </w:tabs>
+        <w:ind w:left="1440" w:hanging="360"/>
+      </w:pPr>
+    </w:lvl>
+    <w:lvl w:ilvl="2" w:tentative="1">
+      <w:start w:val="1"/>
+      <w:numFmt w:val="decimal"/>
+      <w:lvlText w:val="%3."/>
+      <w:lvlJc w:val="left"/>
+      <w:pPr>
+        <w:tabs>
+          <w:tab w:val="num" w:pos="2160"/>
+        </w:tabs>
+        <w:ind w:left="2160" w:hanging="360"/>
+      </w:pPr>
+    </w:lvl>
+    <w:lvl w:ilvl="3" w:tentative="1">
+      <w:start w:val="1"/>
+      <w:numFmt w:val="decimal"/>
+      <w:lvlText w:val="%4."/>
+      <w:lvlJc w:val="left"/>
+      <w:pPr>
+        <w:tabs>
+          <w:tab w:val="num" w:pos="2880"/>
+        </w:tabs>
+        <w:ind w:left="2880" w:hanging="360"/>
+      </w:pPr>
+    </w:lvl>
+    <w:lvl w:ilvl="4" w:tentative="1">
+      <w:start w:val="1"/>
+      <w:numFmt w:val="decimal"/>
+      <w:lvlText w:val="%5."/>
+      <w:lvlJc w:val="left"/>
+      <w:pPr>
+        <w:tabs>
+          <w:tab w:val="num" w:pos="3600"/>
+        </w:tabs>
+        <w:ind w:left="3600" w:hanging="360"/>
+      </w:pPr>
+    </w:lvl>
+    <w:lvl w:ilvl="5" w:tentative="1">
+      <w:start w:val="1"/>
+      <w:numFmt w:val="decimal"/>
+      <w:lvlText w:val="%6."/>
+      <w:lvlJc w:val="left"/>
+      <w:pPr>
+        <w:tabs>
+          <w:tab w:val="num" w:pos="4320"/>
+        </w:tabs>
+        <w:ind w:left="4320" w:hanging="360"/>
+      </w:pPr>
+    </w:lvl>
+    <w:lvl w:ilvl="6" w:tentative="1">
+      <w:start w:val="1"/>
+      <w:numFmt w:val="decimal"/>
+      <w:lvlText w:val="%7."/>
+      <w:lvlJc w:val="left"/>
+      <w:pPr>
+        <w:tabs>
+          <w:tab w:val="num" w:pos="5040"/>
+        </w:tabs>
+        <w:ind w:left="5040" w:hanging="360"/>
+      </w:pPr>
+    </w:lvl>
+    <w:lvl w:ilvl="7" w:tentative="1">
+      <w:start w:val="1"/>
+      <w:numFmt w:val="decimal"/>
+      <w:lvlText w:val="%8."/>
+      <w:lvlJc w:val="left"/>
+      <w:pPr>
+        <w:tabs>
+          <w:tab w:val="num" w:pos="5760"/>
+        </w:tabs>
+        <w:ind w:left="5760" w:hanging="360"/>
+      </w:pPr>
+    </w:lvl>
+    <w:lvl w:ilvl="8" w:tentative="1">
+      <w:start w:val="1"/>
+      <w:numFmt w:val="decimal"/>
+      <w:lvlText w:val="%9."/>
+      <w:lvlJc w:val="left"/>
+      <w:pPr>
+        <w:tabs>
+          <w:tab w:val="num" w:pos="6480"/>
+        </w:tabs>
+        <w:ind w:left="6480" w:hanging="360"/>
+      </w:pPr>
+    </w:lvl>
+  </w:abstractNum>
+  <w:abstractNum w:abstractNumId="1" w15:restartNumberingAfterBreak="0">
     <w:nsid w:val="79AA3529"/>
     <w:multiLevelType w:val="multilevel"/>
     <w:tmpl w:val="4A38B71C"/>
@@ -429,6 +636,9 @@
     </w:lvl>
   </w:abstractNum>
   <w:num w:numId="1">
+    <w:abstractNumId w:val="1"/>
+  </w:num>
+  <w:num w:numId="2">
     <w:abstractNumId w:val="0"/>
   </w:num>
 </w:numbering>

</xml_diff>